<commit_message>
Hien thi danh sach cac contact lay ve tu server
</commit_message>
<xml_diff>
--- a/hình3.docx
+++ b/hình3.docx
@@ -44,6 +44,9 @@
         </w:drawing>
       </w:r>
       <w:r>
+        <w:rPr>
+          <w:noProof/>
+        </w:rPr>
         <w:lastRenderedPageBreak/>
         <w:drawing>
           <wp:inline distT="0" distB="0" distL="0" distR="0" wp14:anchorId="361FA933" wp14:editId="77AAD713">
@@ -82,6 +85,9 @@
         </w:drawing>
       </w:r>
       <w:r>
+        <w:rPr>
+          <w:noProof/>
+        </w:rPr>
         <w:lastRenderedPageBreak/>
         <w:drawing>
           <wp:inline distT="0" distB="0" distL="0" distR="0" wp14:anchorId="3F9564D3" wp14:editId="7F02FBEB">
@@ -120,6 +126,9 @@
         </w:drawing>
       </w:r>
       <w:r>
+        <w:rPr>
+          <w:noProof/>
+        </w:rPr>
         <w:drawing>
           <wp:inline distT="0" distB="0" distL="0" distR="0" wp14:anchorId="0D823119" wp14:editId="3C35F712">
             <wp:extent cx="5943600" cy="4257675"/>
@@ -157,6 +166,9 @@
         </w:drawing>
       </w:r>
       <w:r>
+        <w:rPr>
+          <w:noProof/>
+        </w:rPr>
         <w:lastRenderedPageBreak/>
         <w:drawing>
           <wp:inline distT="0" distB="0" distL="0" distR="0" wp14:anchorId="76884F59" wp14:editId="6B113E3A">
@@ -195,6 +207,9 @@
         </w:drawing>
       </w:r>
       <w:r>
+        <w:rPr>
+          <w:noProof/>
+        </w:rPr>
         <w:drawing>
           <wp:inline distT="0" distB="0" distL="0" distR="0" wp14:anchorId="60408B3A" wp14:editId="1BF21E76">
             <wp:extent cx="5943600" cy="3303270"/>
@@ -232,6 +247,9 @@
         </w:drawing>
       </w:r>
       <w:r>
+        <w:rPr>
+          <w:noProof/>
+        </w:rPr>
         <w:lastRenderedPageBreak/>
         <w:drawing>
           <wp:inline distT="0" distB="0" distL="0" distR="0" wp14:anchorId="7E2D2EF6" wp14:editId="0D77D7F7">
@@ -258,6 +276,918 @@
                     <a:xfrm>
                       <a:off x="0" y="0"/>
                       <a:ext cx="5943600" cy="2458720"/>
+                    </a:xfrm>
+                    <a:prstGeom prst="rect">
+                      <a:avLst/>
+                    </a:prstGeom>
+                  </pic:spPr>
+                </pic:pic>
+              </a:graphicData>
+            </a:graphic>
+          </wp:inline>
+        </w:drawing>
+      </w:r>
+      <w:r>
+        <w:rPr>
+          <w:noProof/>
+        </w:rPr>
+        <w:drawing>
+          <wp:inline distT="0" distB="0" distL="0" distR="0" wp14:anchorId="71CEBE95" wp14:editId="6FFC32AB">
+            <wp:extent cx="5943600" cy="1879600"/>
+            <wp:effectExtent l="0" t="0" r="0" b="6350"/>
+            <wp:docPr id="9" name="Picture 9"/>
+            <wp:cNvGraphicFramePr>
+              <a:graphicFrameLocks xmlns:a="http://schemas.openxmlformats.org/drawingml/2006/main" noChangeAspect="1"/>
+            </wp:cNvGraphicFramePr>
+            <a:graphic xmlns:a="http://schemas.openxmlformats.org/drawingml/2006/main">
+              <a:graphicData uri="http://schemas.openxmlformats.org/drawingml/2006/picture">
+                <pic:pic xmlns:pic="http://schemas.openxmlformats.org/drawingml/2006/picture">
+                  <pic:nvPicPr>
+                    <pic:cNvPr id="1" name=""/>
+                    <pic:cNvPicPr/>
+                  </pic:nvPicPr>
+                  <pic:blipFill>
+                    <a:blip r:embed="rId11"/>
+                    <a:stretch>
+                      <a:fillRect/>
+                    </a:stretch>
+                  </pic:blipFill>
+                  <pic:spPr>
+                    <a:xfrm>
+                      <a:off x="0" y="0"/>
+                      <a:ext cx="5943600" cy="1879600"/>
+                    </a:xfrm>
+                    <a:prstGeom prst="rect">
+                      <a:avLst/>
+                    </a:prstGeom>
+                  </pic:spPr>
+                </pic:pic>
+              </a:graphicData>
+            </a:graphic>
+          </wp:inline>
+        </w:drawing>
+      </w:r>
+      <w:r>
+        <w:rPr>
+          <w:noProof/>
+        </w:rPr>
+        <w:drawing>
+          <wp:inline distT="0" distB="0" distL="0" distR="0" wp14:anchorId="678F80AB" wp14:editId="38EEEC4D">
+            <wp:extent cx="5943600" cy="2697480"/>
+            <wp:effectExtent l="0" t="0" r="0" b="7620"/>
+            <wp:docPr id="10" name="Picture 10"/>
+            <wp:cNvGraphicFramePr>
+              <a:graphicFrameLocks xmlns:a="http://schemas.openxmlformats.org/drawingml/2006/main" noChangeAspect="1"/>
+            </wp:cNvGraphicFramePr>
+            <a:graphic xmlns:a="http://schemas.openxmlformats.org/drawingml/2006/main">
+              <a:graphicData uri="http://schemas.openxmlformats.org/drawingml/2006/picture">
+                <pic:pic xmlns:pic="http://schemas.openxmlformats.org/drawingml/2006/picture">
+                  <pic:nvPicPr>
+                    <pic:cNvPr id="1" name=""/>
+                    <pic:cNvPicPr/>
+                  </pic:nvPicPr>
+                  <pic:blipFill>
+                    <a:blip r:embed="rId12"/>
+                    <a:stretch>
+                      <a:fillRect/>
+                    </a:stretch>
+                  </pic:blipFill>
+                  <pic:spPr>
+                    <a:xfrm>
+                      <a:off x="0" y="0"/>
+                      <a:ext cx="5943600" cy="2697480"/>
+                    </a:xfrm>
+                    <a:prstGeom prst="rect">
+                      <a:avLst/>
+                    </a:prstGeom>
+                  </pic:spPr>
+                </pic:pic>
+              </a:graphicData>
+            </a:graphic>
+          </wp:inline>
+        </w:drawing>
+      </w:r>
+      <w:r>
+        <w:rPr>
+          <w:noProof/>
+        </w:rPr>
+        <w:lastRenderedPageBreak/>
+        <w:drawing>
+          <wp:inline distT="0" distB="0" distL="0" distR="0" wp14:anchorId="0B8C3553" wp14:editId="2BCD4F06">
+            <wp:extent cx="5943600" cy="3498850"/>
+            <wp:effectExtent l="0" t="0" r="0" b="6350"/>
+            <wp:docPr id="11" name="Picture 11"/>
+            <wp:cNvGraphicFramePr>
+              <a:graphicFrameLocks xmlns:a="http://schemas.openxmlformats.org/drawingml/2006/main" noChangeAspect="1"/>
+            </wp:cNvGraphicFramePr>
+            <a:graphic xmlns:a="http://schemas.openxmlformats.org/drawingml/2006/main">
+              <a:graphicData uri="http://schemas.openxmlformats.org/drawingml/2006/picture">
+                <pic:pic xmlns:pic="http://schemas.openxmlformats.org/drawingml/2006/picture">
+                  <pic:nvPicPr>
+                    <pic:cNvPr id="1" name=""/>
+                    <pic:cNvPicPr/>
+                  </pic:nvPicPr>
+                  <pic:blipFill>
+                    <a:blip r:embed="rId13"/>
+                    <a:stretch>
+                      <a:fillRect/>
+                    </a:stretch>
+                  </pic:blipFill>
+                  <pic:spPr>
+                    <a:xfrm>
+                      <a:off x="0" y="0"/>
+                      <a:ext cx="5943600" cy="3498850"/>
+                    </a:xfrm>
+                    <a:prstGeom prst="rect">
+                      <a:avLst/>
+                    </a:prstGeom>
+                  </pic:spPr>
+                </pic:pic>
+              </a:graphicData>
+            </a:graphic>
+          </wp:inline>
+        </w:drawing>
+      </w:r>
+      <w:r>
+        <w:rPr>
+          <w:noProof/>
+        </w:rPr>
+        <w:drawing>
+          <wp:inline distT="0" distB="0" distL="0" distR="0" wp14:anchorId="400D94DC" wp14:editId="18606337">
+            <wp:extent cx="5943600" cy="1727200"/>
+            <wp:effectExtent l="0" t="0" r="0" b="6350"/>
+            <wp:docPr id="12" name="Picture 12"/>
+            <wp:cNvGraphicFramePr>
+              <a:graphicFrameLocks xmlns:a="http://schemas.openxmlformats.org/drawingml/2006/main" noChangeAspect="1"/>
+            </wp:cNvGraphicFramePr>
+            <a:graphic xmlns:a="http://schemas.openxmlformats.org/drawingml/2006/main">
+              <a:graphicData uri="http://schemas.openxmlformats.org/drawingml/2006/picture">
+                <pic:pic xmlns:pic="http://schemas.openxmlformats.org/drawingml/2006/picture">
+                  <pic:nvPicPr>
+                    <pic:cNvPr id="1" name=""/>
+                    <pic:cNvPicPr/>
+                  </pic:nvPicPr>
+                  <pic:blipFill>
+                    <a:blip r:embed="rId14"/>
+                    <a:stretch>
+                      <a:fillRect/>
+                    </a:stretch>
+                  </pic:blipFill>
+                  <pic:spPr>
+                    <a:xfrm>
+                      <a:off x="0" y="0"/>
+                      <a:ext cx="5943600" cy="1727200"/>
+                    </a:xfrm>
+                    <a:prstGeom prst="rect">
+                      <a:avLst/>
+                    </a:prstGeom>
+                  </pic:spPr>
+                </pic:pic>
+              </a:graphicData>
+            </a:graphic>
+          </wp:inline>
+        </w:drawing>
+      </w:r>
+      <w:r>
+        <w:rPr>
+          <w:noProof/>
+        </w:rPr>
+        <w:drawing>
+          <wp:inline distT="0" distB="0" distL="0" distR="0" wp14:anchorId="350099A7" wp14:editId="61634A62">
+            <wp:extent cx="5943600" cy="2855595"/>
+            <wp:effectExtent l="0" t="0" r="0" b="1905"/>
+            <wp:docPr id="13" name="Picture 13"/>
+            <wp:cNvGraphicFramePr>
+              <a:graphicFrameLocks xmlns:a="http://schemas.openxmlformats.org/drawingml/2006/main" noChangeAspect="1"/>
+            </wp:cNvGraphicFramePr>
+            <a:graphic xmlns:a="http://schemas.openxmlformats.org/drawingml/2006/main">
+              <a:graphicData uri="http://schemas.openxmlformats.org/drawingml/2006/picture">
+                <pic:pic xmlns:pic="http://schemas.openxmlformats.org/drawingml/2006/picture">
+                  <pic:nvPicPr>
+                    <pic:cNvPr id="1" name=""/>
+                    <pic:cNvPicPr/>
+                  </pic:nvPicPr>
+                  <pic:blipFill>
+                    <a:blip r:embed="rId15"/>
+                    <a:stretch>
+                      <a:fillRect/>
+                    </a:stretch>
+                  </pic:blipFill>
+                  <pic:spPr>
+                    <a:xfrm>
+                      <a:off x="0" y="0"/>
+                      <a:ext cx="5943600" cy="2855595"/>
+                    </a:xfrm>
+                    <a:prstGeom prst="rect">
+                      <a:avLst/>
+                    </a:prstGeom>
+                  </pic:spPr>
+                </pic:pic>
+              </a:graphicData>
+            </a:graphic>
+          </wp:inline>
+        </w:drawing>
+      </w:r>
+      <w:r>
+        <w:lastRenderedPageBreak/>
+        <w:drawing>
+          <wp:inline distT="0" distB="0" distL="0" distR="0" wp14:anchorId="03A0D68C" wp14:editId="3A317779">
+            <wp:extent cx="5943600" cy="4211320"/>
+            <wp:effectExtent l="0" t="0" r="0" b="0"/>
+            <wp:docPr id="2" name="Picture 2"/>
+            <wp:cNvGraphicFramePr>
+              <a:graphicFrameLocks xmlns:a="http://schemas.openxmlformats.org/drawingml/2006/main" noChangeAspect="1"/>
+            </wp:cNvGraphicFramePr>
+            <a:graphic xmlns:a="http://schemas.openxmlformats.org/drawingml/2006/main">
+              <a:graphicData uri="http://schemas.openxmlformats.org/drawingml/2006/picture">
+                <pic:pic xmlns:pic="http://schemas.openxmlformats.org/drawingml/2006/picture">
+                  <pic:nvPicPr>
+                    <pic:cNvPr id="1" name=""/>
+                    <pic:cNvPicPr/>
+                  </pic:nvPicPr>
+                  <pic:blipFill>
+                    <a:blip r:embed="rId16"/>
+                    <a:stretch>
+                      <a:fillRect/>
+                    </a:stretch>
+                  </pic:blipFill>
+                  <pic:spPr>
+                    <a:xfrm>
+                      <a:off x="0" y="0"/>
+                      <a:ext cx="5943600" cy="4211320"/>
+                    </a:xfrm>
+                    <a:prstGeom prst="rect">
+                      <a:avLst/>
+                    </a:prstGeom>
+                  </pic:spPr>
+                </pic:pic>
+              </a:graphicData>
+            </a:graphic>
+          </wp:inline>
+        </w:drawing>
+      </w:r>
+      <w:r>
+        <w:drawing>
+          <wp:inline distT="0" distB="0" distL="0" distR="0" wp14:anchorId="01CC6176" wp14:editId="06F4B6B9">
+            <wp:extent cx="5943600" cy="3027680"/>
+            <wp:effectExtent l="0" t="0" r="0" b="1270"/>
+            <wp:docPr id="14" name="Picture 14"/>
+            <wp:cNvGraphicFramePr>
+              <a:graphicFrameLocks xmlns:a="http://schemas.openxmlformats.org/drawingml/2006/main" noChangeAspect="1"/>
+            </wp:cNvGraphicFramePr>
+            <a:graphic xmlns:a="http://schemas.openxmlformats.org/drawingml/2006/main">
+              <a:graphicData uri="http://schemas.openxmlformats.org/drawingml/2006/picture">
+                <pic:pic xmlns:pic="http://schemas.openxmlformats.org/drawingml/2006/picture">
+                  <pic:nvPicPr>
+                    <pic:cNvPr id="1" name=""/>
+                    <pic:cNvPicPr/>
+                  </pic:nvPicPr>
+                  <pic:blipFill>
+                    <a:blip r:embed="rId17"/>
+                    <a:stretch>
+                      <a:fillRect/>
+                    </a:stretch>
+                  </pic:blipFill>
+                  <pic:spPr>
+                    <a:xfrm>
+                      <a:off x="0" y="0"/>
+                      <a:ext cx="5943600" cy="3027680"/>
+                    </a:xfrm>
+                    <a:prstGeom prst="rect">
+                      <a:avLst/>
+                    </a:prstGeom>
+                  </pic:spPr>
+                </pic:pic>
+              </a:graphicData>
+            </a:graphic>
+          </wp:inline>
+        </w:drawing>
+      </w:r>
+      <w:r>
+        <w:lastRenderedPageBreak/>
+        <w:drawing>
+          <wp:inline distT="0" distB="0" distL="0" distR="0" wp14:anchorId="127D1B6C" wp14:editId="0C48925F">
+            <wp:extent cx="5943600" cy="1468755"/>
+            <wp:effectExtent l="0" t="0" r="0" b="0"/>
+            <wp:docPr id="15" name="Picture 15"/>
+            <wp:cNvGraphicFramePr>
+              <a:graphicFrameLocks xmlns:a="http://schemas.openxmlformats.org/drawingml/2006/main" noChangeAspect="1"/>
+            </wp:cNvGraphicFramePr>
+            <a:graphic xmlns:a="http://schemas.openxmlformats.org/drawingml/2006/main">
+              <a:graphicData uri="http://schemas.openxmlformats.org/drawingml/2006/picture">
+                <pic:pic xmlns:pic="http://schemas.openxmlformats.org/drawingml/2006/picture">
+                  <pic:nvPicPr>
+                    <pic:cNvPr id="1" name=""/>
+                    <pic:cNvPicPr/>
+                  </pic:nvPicPr>
+                  <pic:blipFill>
+                    <a:blip r:embed="rId18"/>
+                    <a:stretch>
+                      <a:fillRect/>
+                    </a:stretch>
+                  </pic:blipFill>
+                  <pic:spPr>
+                    <a:xfrm>
+                      <a:off x="0" y="0"/>
+                      <a:ext cx="5943600" cy="1468755"/>
+                    </a:xfrm>
+                    <a:prstGeom prst="rect">
+                      <a:avLst/>
+                    </a:prstGeom>
+                  </pic:spPr>
+                </pic:pic>
+              </a:graphicData>
+            </a:graphic>
+          </wp:inline>
+        </w:drawing>
+      </w:r>
+      <w:r>
+        <w:drawing>
+          <wp:inline distT="0" distB="0" distL="0" distR="0" wp14:anchorId="271571C2" wp14:editId="70FA945B">
+            <wp:extent cx="5943600" cy="1727835"/>
+            <wp:effectExtent l="0" t="0" r="0" b="5715"/>
+            <wp:docPr id="16" name="Picture 16"/>
+            <wp:cNvGraphicFramePr>
+              <a:graphicFrameLocks xmlns:a="http://schemas.openxmlformats.org/drawingml/2006/main" noChangeAspect="1"/>
+            </wp:cNvGraphicFramePr>
+            <a:graphic xmlns:a="http://schemas.openxmlformats.org/drawingml/2006/main">
+              <a:graphicData uri="http://schemas.openxmlformats.org/drawingml/2006/picture">
+                <pic:pic xmlns:pic="http://schemas.openxmlformats.org/drawingml/2006/picture">
+                  <pic:nvPicPr>
+                    <pic:cNvPr id="1" name=""/>
+                    <pic:cNvPicPr/>
+                  </pic:nvPicPr>
+                  <pic:blipFill>
+                    <a:blip r:embed="rId19"/>
+                    <a:stretch>
+                      <a:fillRect/>
+                    </a:stretch>
+                  </pic:blipFill>
+                  <pic:spPr>
+                    <a:xfrm>
+                      <a:off x="0" y="0"/>
+                      <a:ext cx="5943600" cy="1727835"/>
+                    </a:xfrm>
+                    <a:prstGeom prst="rect">
+                      <a:avLst/>
+                    </a:prstGeom>
+                  </pic:spPr>
+                </pic:pic>
+              </a:graphicData>
+            </a:graphic>
+          </wp:inline>
+        </w:drawing>
+      </w:r>
+      <w:r>
+        <w:drawing>
+          <wp:inline distT="0" distB="0" distL="0" distR="0" wp14:anchorId="0D0B10EF" wp14:editId="2E048B48">
+            <wp:extent cx="5943600" cy="1591945"/>
+            <wp:effectExtent l="0" t="0" r="0" b="8255"/>
+            <wp:docPr id="17" name="Picture 17"/>
+            <wp:cNvGraphicFramePr>
+              <a:graphicFrameLocks xmlns:a="http://schemas.openxmlformats.org/drawingml/2006/main" noChangeAspect="1"/>
+            </wp:cNvGraphicFramePr>
+            <a:graphic xmlns:a="http://schemas.openxmlformats.org/drawingml/2006/main">
+              <a:graphicData uri="http://schemas.openxmlformats.org/drawingml/2006/picture">
+                <pic:pic xmlns:pic="http://schemas.openxmlformats.org/drawingml/2006/picture">
+                  <pic:nvPicPr>
+                    <pic:cNvPr id="1" name=""/>
+                    <pic:cNvPicPr/>
+                  </pic:nvPicPr>
+                  <pic:blipFill>
+                    <a:blip r:embed="rId20"/>
+                    <a:stretch>
+                      <a:fillRect/>
+                    </a:stretch>
+                  </pic:blipFill>
+                  <pic:spPr>
+                    <a:xfrm>
+                      <a:off x="0" y="0"/>
+                      <a:ext cx="5943600" cy="1591945"/>
+                    </a:xfrm>
+                    <a:prstGeom prst="rect">
+                      <a:avLst/>
+                    </a:prstGeom>
+                  </pic:spPr>
+                </pic:pic>
+              </a:graphicData>
+            </a:graphic>
+          </wp:inline>
+        </w:drawing>
+      </w:r>
+      <w:r>
+        <w:drawing>
+          <wp:inline distT="0" distB="0" distL="0" distR="0" wp14:anchorId="583AC04F" wp14:editId="7B55D90A">
+            <wp:extent cx="5943600" cy="2216785"/>
+            <wp:effectExtent l="0" t="0" r="0" b="0"/>
+            <wp:docPr id="18" name="Picture 18"/>
+            <wp:cNvGraphicFramePr>
+              <a:graphicFrameLocks xmlns:a="http://schemas.openxmlformats.org/drawingml/2006/main" noChangeAspect="1"/>
+            </wp:cNvGraphicFramePr>
+            <a:graphic xmlns:a="http://schemas.openxmlformats.org/drawingml/2006/main">
+              <a:graphicData uri="http://schemas.openxmlformats.org/drawingml/2006/picture">
+                <pic:pic xmlns:pic="http://schemas.openxmlformats.org/drawingml/2006/picture">
+                  <pic:nvPicPr>
+                    <pic:cNvPr id="1" name=""/>
+                    <pic:cNvPicPr/>
+                  </pic:nvPicPr>
+                  <pic:blipFill>
+                    <a:blip r:embed="rId21"/>
+                    <a:stretch>
+                      <a:fillRect/>
+                    </a:stretch>
+                  </pic:blipFill>
+                  <pic:spPr>
+                    <a:xfrm>
+                      <a:off x="0" y="0"/>
+                      <a:ext cx="5943600" cy="2216785"/>
+                    </a:xfrm>
+                    <a:prstGeom prst="rect">
+                      <a:avLst/>
+                    </a:prstGeom>
+                  </pic:spPr>
+                </pic:pic>
+              </a:graphicData>
+            </a:graphic>
+          </wp:inline>
+        </w:drawing>
+      </w:r>
+      <w:r>
+        <w:lastRenderedPageBreak/>
+        <w:drawing>
+          <wp:inline distT="0" distB="0" distL="0" distR="0" wp14:anchorId="3E0263C2" wp14:editId="7A42C0E6">
+            <wp:extent cx="5943600" cy="1429385"/>
+            <wp:effectExtent l="0" t="0" r="0" b="0"/>
+            <wp:docPr id="31" name="Picture 31"/>
+            <wp:cNvGraphicFramePr>
+              <a:graphicFrameLocks xmlns:a="http://schemas.openxmlformats.org/drawingml/2006/main" noChangeAspect="1"/>
+            </wp:cNvGraphicFramePr>
+            <a:graphic xmlns:a="http://schemas.openxmlformats.org/drawingml/2006/main">
+              <a:graphicData uri="http://schemas.openxmlformats.org/drawingml/2006/picture">
+                <pic:pic xmlns:pic="http://schemas.openxmlformats.org/drawingml/2006/picture">
+                  <pic:nvPicPr>
+                    <pic:cNvPr id="1" name=""/>
+                    <pic:cNvPicPr/>
+                  </pic:nvPicPr>
+                  <pic:blipFill>
+                    <a:blip r:embed="rId22"/>
+                    <a:stretch>
+                      <a:fillRect/>
+                    </a:stretch>
+                  </pic:blipFill>
+                  <pic:spPr>
+                    <a:xfrm>
+                      <a:off x="0" y="0"/>
+                      <a:ext cx="5943600" cy="1429385"/>
+                    </a:xfrm>
+                    <a:prstGeom prst="rect">
+                      <a:avLst/>
+                    </a:prstGeom>
+                  </pic:spPr>
+                </pic:pic>
+              </a:graphicData>
+            </a:graphic>
+          </wp:inline>
+        </w:drawing>
+      </w:r>
+      <w:r>
+        <w:drawing>
+          <wp:inline distT="0" distB="0" distL="0" distR="0" wp14:anchorId="69B1CFAE" wp14:editId="10B6E3FA">
+            <wp:extent cx="5943600" cy="4597400"/>
+            <wp:effectExtent l="0" t="0" r="0" b="0"/>
+            <wp:docPr id="20" name="Picture 20"/>
+            <wp:cNvGraphicFramePr>
+              <a:graphicFrameLocks xmlns:a="http://schemas.openxmlformats.org/drawingml/2006/main" noChangeAspect="1"/>
+            </wp:cNvGraphicFramePr>
+            <a:graphic xmlns:a="http://schemas.openxmlformats.org/drawingml/2006/main">
+              <a:graphicData uri="http://schemas.openxmlformats.org/drawingml/2006/picture">
+                <pic:pic xmlns:pic="http://schemas.openxmlformats.org/drawingml/2006/picture">
+                  <pic:nvPicPr>
+                    <pic:cNvPr id="1" name=""/>
+                    <pic:cNvPicPr/>
+                  </pic:nvPicPr>
+                  <pic:blipFill>
+                    <a:blip r:embed="rId23"/>
+                    <a:stretch>
+                      <a:fillRect/>
+                    </a:stretch>
+                  </pic:blipFill>
+                  <pic:spPr>
+                    <a:xfrm>
+                      <a:off x="0" y="0"/>
+                      <a:ext cx="5943600" cy="4597400"/>
+                    </a:xfrm>
+                    <a:prstGeom prst="rect">
+                      <a:avLst/>
+                    </a:prstGeom>
+                  </pic:spPr>
+                </pic:pic>
+              </a:graphicData>
+            </a:graphic>
+          </wp:inline>
+        </w:drawing>
+      </w:r>
+      <w:r>
+        <w:lastRenderedPageBreak/>
+        <w:drawing>
+          <wp:inline distT="0" distB="0" distL="0" distR="0" wp14:anchorId="08BBDE4F" wp14:editId="1C327E95">
+            <wp:extent cx="5943600" cy="3123565"/>
+            <wp:effectExtent l="0" t="0" r="0" b="635"/>
+            <wp:docPr id="21" name="Picture 21"/>
+            <wp:cNvGraphicFramePr>
+              <a:graphicFrameLocks xmlns:a="http://schemas.openxmlformats.org/drawingml/2006/main" noChangeAspect="1"/>
+            </wp:cNvGraphicFramePr>
+            <a:graphic xmlns:a="http://schemas.openxmlformats.org/drawingml/2006/main">
+              <a:graphicData uri="http://schemas.openxmlformats.org/drawingml/2006/picture">
+                <pic:pic xmlns:pic="http://schemas.openxmlformats.org/drawingml/2006/picture">
+                  <pic:nvPicPr>
+                    <pic:cNvPr id="1" name=""/>
+                    <pic:cNvPicPr/>
+                  </pic:nvPicPr>
+                  <pic:blipFill>
+                    <a:blip r:embed="rId24"/>
+                    <a:stretch>
+                      <a:fillRect/>
+                    </a:stretch>
+                  </pic:blipFill>
+                  <pic:spPr>
+                    <a:xfrm>
+                      <a:off x="0" y="0"/>
+                      <a:ext cx="5943600" cy="3123565"/>
+                    </a:xfrm>
+                    <a:prstGeom prst="rect">
+                      <a:avLst/>
+                    </a:prstGeom>
+                  </pic:spPr>
+                </pic:pic>
+              </a:graphicData>
+            </a:graphic>
+          </wp:inline>
+        </w:drawing>
+      </w:r>
+      <w:r>
+        <w:drawing>
+          <wp:inline distT="0" distB="0" distL="0" distR="0" wp14:anchorId="14CAB336" wp14:editId="28B8C787">
+            <wp:extent cx="5943600" cy="2995930"/>
+            <wp:effectExtent l="0" t="0" r="0" b="0"/>
+            <wp:docPr id="22" name="Picture 22"/>
+            <wp:cNvGraphicFramePr>
+              <a:graphicFrameLocks xmlns:a="http://schemas.openxmlformats.org/drawingml/2006/main" noChangeAspect="1"/>
+            </wp:cNvGraphicFramePr>
+            <a:graphic xmlns:a="http://schemas.openxmlformats.org/drawingml/2006/main">
+              <a:graphicData uri="http://schemas.openxmlformats.org/drawingml/2006/picture">
+                <pic:pic xmlns:pic="http://schemas.openxmlformats.org/drawingml/2006/picture">
+                  <pic:nvPicPr>
+                    <pic:cNvPr id="1" name=""/>
+                    <pic:cNvPicPr/>
+                  </pic:nvPicPr>
+                  <pic:blipFill>
+                    <a:blip r:embed="rId25"/>
+                    <a:stretch>
+                      <a:fillRect/>
+                    </a:stretch>
+                  </pic:blipFill>
+                  <pic:spPr>
+                    <a:xfrm>
+                      <a:off x="0" y="0"/>
+                      <a:ext cx="5943600" cy="2995930"/>
+                    </a:xfrm>
+                    <a:prstGeom prst="rect">
+                      <a:avLst/>
+                    </a:prstGeom>
+                  </pic:spPr>
+                </pic:pic>
+              </a:graphicData>
+            </a:graphic>
+          </wp:inline>
+        </w:drawing>
+      </w:r>
+      <w:r>
+        <w:lastRenderedPageBreak/>
+        <w:drawing>
+          <wp:inline distT="0" distB="0" distL="0" distR="0" wp14:anchorId="20CC951E" wp14:editId="3DBBDFCB">
+            <wp:extent cx="5943600" cy="2757170"/>
+            <wp:effectExtent l="0" t="0" r="0" b="5080"/>
+            <wp:docPr id="23" name="Picture 23"/>
+            <wp:cNvGraphicFramePr>
+              <a:graphicFrameLocks xmlns:a="http://schemas.openxmlformats.org/drawingml/2006/main" noChangeAspect="1"/>
+            </wp:cNvGraphicFramePr>
+            <a:graphic xmlns:a="http://schemas.openxmlformats.org/drawingml/2006/main">
+              <a:graphicData uri="http://schemas.openxmlformats.org/drawingml/2006/picture">
+                <pic:pic xmlns:pic="http://schemas.openxmlformats.org/drawingml/2006/picture">
+                  <pic:nvPicPr>
+                    <pic:cNvPr id="1" name=""/>
+                    <pic:cNvPicPr/>
+                  </pic:nvPicPr>
+                  <pic:blipFill>
+                    <a:blip r:embed="rId26"/>
+                    <a:stretch>
+                      <a:fillRect/>
+                    </a:stretch>
+                  </pic:blipFill>
+                  <pic:spPr>
+                    <a:xfrm>
+                      <a:off x="0" y="0"/>
+                      <a:ext cx="5943600" cy="2757170"/>
+                    </a:xfrm>
+                    <a:prstGeom prst="rect">
+                      <a:avLst/>
+                    </a:prstGeom>
+                  </pic:spPr>
+                </pic:pic>
+              </a:graphicData>
+            </a:graphic>
+          </wp:inline>
+        </w:drawing>
+      </w:r>
+      <w:r>
+        <w:drawing>
+          <wp:inline distT="0" distB="0" distL="0" distR="0" wp14:anchorId="2E456CA6" wp14:editId="2F54FB27">
+            <wp:extent cx="5943600" cy="3985895"/>
+            <wp:effectExtent l="0" t="0" r="0" b="0"/>
+            <wp:docPr id="24" name="Picture 24"/>
+            <wp:cNvGraphicFramePr>
+              <a:graphicFrameLocks xmlns:a="http://schemas.openxmlformats.org/drawingml/2006/main" noChangeAspect="1"/>
+            </wp:cNvGraphicFramePr>
+            <a:graphic xmlns:a="http://schemas.openxmlformats.org/drawingml/2006/main">
+              <a:graphicData uri="http://schemas.openxmlformats.org/drawingml/2006/picture">
+                <pic:pic xmlns:pic="http://schemas.openxmlformats.org/drawingml/2006/picture">
+                  <pic:nvPicPr>
+                    <pic:cNvPr id="1" name=""/>
+                    <pic:cNvPicPr/>
+                  </pic:nvPicPr>
+                  <pic:blipFill>
+                    <a:blip r:embed="rId27"/>
+                    <a:stretch>
+                      <a:fillRect/>
+                    </a:stretch>
+                  </pic:blipFill>
+                  <pic:spPr>
+                    <a:xfrm>
+                      <a:off x="0" y="0"/>
+                      <a:ext cx="5943600" cy="3985895"/>
+                    </a:xfrm>
+                    <a:prstGeom prst="rect">
+                      <a:avLst/>
+                    </a:prstGeom>
+                  </pic:spPr>
+                </pic:pic>
+              </a:graphicData>
+            </a:graphic>
+          </wp:inline>
+        </w:drawing>
+      </w:r>
+      <w:r>
+        <w:lastRenderedPageBreak/>
+        <w:drawing>
+          <wp:inline distT="0" distB="0" distL="0" distR="0" wp14:anchorId="4EF3FFC6" wp14:editId="24611B65">
+            <wp:extent cx="5943600" cy="3455670"/>
+            <wp:effectExtent l="0" t="0" r="0" b="0"/>
+            <wp:docPr id="25" name="Picture 25"/>
+            <wp:cNvGraphicFramePr>
+              <a:graphicFrameLocks xmlns:a="http://schemas.openxmlformats.org/drawingml/2006/main" noChangeAspect="1"/>
+            </wp:cNvGraphicFramePr>
+            <a:graphic xmlns:a="http://schemas.openxmlformats.org/drawingml/2006/main">
+              <a:graphicData uri="http://schemas.openxmlformats.org/drawingml/2006/picture">
+                <pic:pic xmlns:pic="http://schemas.openxmlformats.org/drawingml/2006/picture">
+                  <pic:nvPicPr>
+                    <pic:cNvPr id="1" name=""/>
+                    <pic:cNvPicPr/>
+                  </pic:nvPicPr>
+                  <pic:blipFill>
+                    <a:blip r:embed="rId28"/>
+                    <a:stretch>
+                      <a:fillRect/>
+                    </a:stretch>
+                  </pic:blipFill>
+                  <pic:spPr>
+                    <a:xfrm>
+                      <a:off x="0" y="0"/>
+                      <a:ext cx="5943600" cy="3455670"/>
+                    </a:xfrm>
+                    <a:prstGeom prst="rect">
+                      <a:avLst/>
+                    </a:prstGeom>
+                  </pic:spPr>
+                </pic:pic>
+              </a:graphicData>
+            </a:graphic>
+          </wp:inline>
+        </w:drawing>
+      </w:r>
+      <w:r>
+        <w:drawing>
+          <wp:inline distT="0" distB="0" distL="0" distR="0" wp14:anchorId="23C644B4" wp14:editId="4BF290C4">
+            <wp:extent cx="5943600" cy="3494405"/>
+            <wp:effectExtent l="0" t="0" r="0" b="0"/>
+            <wp:docPr id="27" name="Picture 27"/>
+            <wp:cNvGraphicFramePr>
+              <a:graphicFrameLocks xmlns:a="http://schemas.openxmlformats.org/drawingml/2006/main" noChangeAspect="1"/>
+            </wp:cNvGraphicFramePr>
+            <a:graphic xmlns:a="http://schemas.openxmlformats.org/drawingml/2006/main">
+              <a:graphicData uri="http://schemas.openxmlformats.org/drawingml/2006/picture">
+                <pic:pic xmlns:pic="http://schemas.openxmlformats.org/drawingml/2006/picture">
+                  <pic:nvPicPr>
+                    <pic:cNvPr id="1" name=""/>
+                    <pic:cNvPicPr/>
+                  </pic:nvPicPr>
+                  <pic:blipFill>
+                    <a:blip r:embed="rId29"/>
+                    <a:stretch>
+                      <a:fillRect/>
+                    </a:stretch>
+                  </pic:blipFill>
+                  <pic:spPr>
+                    <a:xfrm>
+                      <a:off x="0" y="0"/>
+                      <a:ext cx="5943600" cy="3494405"/>
+                    </a:xfrm>
+                    <a:prstGeom prst="rect">
+                      <a:avLst/>
+                    </a:prstGeom>
+                  </pic:spPr>
+                </pic:pic>
+              </a:graphicData>
+            </a:graphic>
+          </wp:inline>
+        </w:drawing>
+      </w:r>
+      <w:r>
+        <w:lastRenderedPageBreak/>
+        <w:drawing>
+          <wp:inline distT="0" distB="0" distL="0" distR="0" wp14:anchorId="6961C7FD" wp14:editId="3DCCFEF9">
+            <wp:extent cx="5943600" cy="2637790"/>
+            <wp:effectExtent l="0" t="0" r="0" b="0"/>
+            <wp:docPr id="26" name="Picture 26"/>
+            <wp:cNvGraphicFramePr>
+              <a:graphicFrameLocks xmlns:a="http://schemas.openxmlformats.org/drawingml/2006/main" noChangeAspect="1"/>
+            </wp:cNvGraphicFramePr>
+            <a:graphic xmlns:a="http://schemas.openxmlformats.org/drawingml/2006/main">
+              <a:graphicData uri="http://schemas.openxmlformats.org/drawingml/2006/picture">
+                <pic:pic xmlns:pic="http://schemas.openxmlformats.org/drawingml/2006/picture">
+                  <pic:nvPicPr>
+                    <pic:cNvPr id="1" name=""/>
+                    <pic:cNvPicPr/>
+                  </pic:nvPicPr>
+                  <pic:blipFill>
+                    <a:blip r:embed="rId30"/>
+                    <a:stretch>
+                      <a:fillRect/>
+                    </a:stretch>
+                  </pic:blipFill>
+                  <pic:spPr>
+                    <a:xfrm>
+                      <a:off x="0" y="0"/>
+                      <a:ext cx="5943600" cy="2637790"/>
+                    </a:xfrm>
+                    <a:prstGeom prst="rect">
+                      <a:avLst/>
+                    </a:prstGeom>
+                  </pic:spPr>
+                </pic:pic>
+              </a:graphicData>
+            </a:graphic>
+          </wp:inline>
+        </w:drawing>
+      </w:r>
+      <w:r>
+        <w:drawing>
+          <wp:inline distT="0" distB="0" distL="0" distR="0" wp14:anchorId="356E674E" wp14:editId="6B6C1D41">
+            <wp:extent cx="5943600" cy="2274570"/>
+            <wp:effectExtent l="0" t="0" r="0" b="0"/>
+            <wp:docPr id="28" name="Picture 28"/>
+            <wp:cNvGraphicFramePr>
+              <a:graphicFrameLocks xmlns:a="http://schemas.openxmlformats.org/drawingml/2006/main" noChangeAspect="1"/>
+            </wp:cNvGraphicFramePr>
+            <a:graphic xmlns:a="http://schemas.openxmlformats.org/drawingml/2006/main">
+              <a:graphicData uri="http://schemas.openxmlformats.org/drawingml/2006/picture">
+                <pic:pic xmlns:pic="http://schemas.openxmlformats.org/drawingml/2006/picture">
+                  <pic:nvPicPr>
+                    <pic:cNvPr id="1" name=""/>
+                    <pic:cNvPicPr/>
+                  </pic:nvPicPr>
+                  <pic:blipFill>
+                    <a:blip r:embed="rId31"/>
+                    <a:stretch>
+                      <a:fillRect/>
+                    </a:stretch>
+                  </pic:blipFill>
+                  <pic:spPr>
+                    <a:xfrm>
+                      <a:off x="0" y="0"/>
+                      <a:ext cx="5943600" cy="2274570"/>
+                    </a:xfrm>
+                    <a:prstGeom prst="rect">
+                      <a:avLst/>
+                    </a:prstGeom>
+                  </pic:spPr>
+                </pic:pic>
+              </a:graphicData>
+            </a:graphic>
+          </wp:inline>
+        </w:drawing>
+      </w:r>
+      <w:r>
+        <w:drawing>
+          <wp:inline distT="0" distB="0" distL="0" distR="0" wp14:anchorId="2056DFC7" wp14:editId="3122C435">
+            <wp:extent cx="5943600" cy="2063750"/>
+            <wp:effectExtent l="0" t="0" r="0" b="0"/>
+            <wp:docPr id="29" name="Picture 29"/>
+            <wp:cNvGraphicFramePr>
+              <a:graphicFrameLocks xmlns:a="http://schemas.openxmlformats.org/drawingml/2006/main" noChangeAspect="1"/>
+            </wp:cNvGraphicFramePr>
+            <a:graphic xmlns:a="http://schemas.openxmlformats.org/drawingml/2006/main">
+              <a:graphicData uri="http://schemas.openxmlformats.org/drawingml/2006/picture">
+                <pic:pic xmlns:pic="http://schemas.openxmlformats.org/drawingml/2006/picture">
+                  <pic:nvPicPr>
+                    <pic:cNvPr id="1" name=""/>
+                    <pic:cNvPicPr/>
+                  </pic:nvPicPr>
+                  <pic:blipFill>
+                    <a:blip r:embed="rId32"/>
+                    <a:stretch>
+                      <a:fillRect/>
+                    </a:stretch>
+                  </pic:blipFill>
+                  <pic:spPr>
+                    <a:xfrm>
+                      <a:off x="0" y="0"/>
+                      <a:ext cx="5943600" cy="2063750"/>
+                    </a:xfrm>
+                    <a:prstGeom prst="rect">
+                      <a:avLst/>
+                    </a:prstGeom>
+                  </pic:spPr>
+                </pic:pic>
+              </a:graphicData>
+            </a:graphic>
+          </wp:inline>
+        </w:drawing>
+      </w:r>
+      <w:r>
+        <w:lastRenderedPageBreak/>
+        <w:drawing>
+          <wp:inline distT="0" distB="0" distL="0" distR="0" wp14:anchorId="5C507584" wp14:editId="0009177D">
+            <wp:extent cx="5943600" cy="3958590"/>
+            <wp:effectExtent l="0" t="0" r="0" b="3810"/>
+            <wp:docPr id="30" name="Picture 30"/>
+            <wp:cNvGraphicFramePr>
+              <a:graphicFrameLocks xmlns:a="http://schemas.openxmlformats.org/drawingml/2006/main" noChangeAspect="1"/>
+            </wp:cNvGraphicFramePr>
+            <a:graphic xmlns:a="http://schemas.openxmlformats.org/drawingml/2006/main">
+              <a:graphicData uri="http://schemas.openxmlformats.org/drawingml/2006/picture">
+                <pic:pic xmlns:pic="http://schemas.openxmlformats.org/drawingml/2006/picture">
+                  <pic:nvPicPr>
+                    <pic:cNvPr id="1" name=""/>
+                    <pic:cNvPicPr/>
+                  </pic:nvPicPr>
+                  <pic:blipFill>
+                    <a:blip r:embed="rId33"/>
+                    <a:stretch>
+                      <a:fillRect/>
+                    </a:stretch>
+                  </pic:blipFill>
+                  <pic:spPr>
+                    <a:xfrm>
+                      <a:off x="0" y="0"/>
+                      <a:ext cx="5943600" cy="3958590"/>
+                    </a:xfrm>
+                    <a:prstGeom prst="rect">
+                      <a:avLst/>
+                    </a:prstGeom>
+                  </pic:spPr>
+                </pic:pic>
+              </a:graphicData>
+            </a:graphic>
+          </wp:inline>
+        </w:drawing>
+      </w:r>
+      <w:r>
+        <w:drawing>
+          <wp:inline distT="0" distB="0" distL="0" distR="0" wp14:anchorId="368CCCFB" wp14:editId="04A93664">
+            <wp:extent cx="5943600" cy="3244215"/>
+            <wp:effectExtent l="0" t="0" r="0" b="0"/>
+            <wp:docPr id="32" name="Picture 32"/>
+            <wp:cNvGraphicFramePr>
+              <a:graphicFrameLocks xmlns:a="http://schemas.openxmlformats.org/drawingml/2006/main" noChangeAspect="1"/>
+            </wp:cNvGraphicFramePr>
+            <a:graphic xmlns:a="http://schemas.openxmlformats.org/drawingml/2006/main">
+              <a:graphicData uri="http://schemas.openxmlformats.org/drawingml/2006/picture">
+                <pic:pic xmlns:pic="http://schemas.openxmlformats.org/drawingml/2006/picture">
+                  <pic:nvPicPr>
+                    <pic:cNvPr id="1" name=""/>
+                    <pic:cNvPicPr/>
+                  </pic:nvPicPr>
+                  <pic:blipFill>
+                    <a:blip r:embed="rId34"/>
+                    <a:stretch>
+                      <a:fillRect/>
+                    </a:stretch>
+                  </pic:blipFill>
+                  <pic:spPr>
+                    <a:xfrm>
+                      <a:off x="0" y="0"/>
+                      <a:ext cx="5943600" cy="3244215"/>
                     </a:xfrm>
                     <a:prstGeom prst="rect">
                       <a:avLst/>

</xml_diff>

<commit_message>
Tao trang cap nhat lien he
</commit_message>
<xml_diff>
--- a/hình3.docx
+++ b/hình3.docx
@@ -1188,6 +1188,566 @@
                     <a:xfrm>
                       <a:off x="0" y="0"/>
                       <a:ext cx="5943600" cy="3244215"/>
+                    </a:xfrm>
+                    <a:prstGeom prst="rect">
+                      <a:avLst/>
+                    </a:prstGeom>
+                  </pic:spPr>
+                </pic:pic>
+              </a:graphicData>
+            </a:graphic>
+          </wp:inline>
+        </w:drawing>
+      </w:r>
+      <w:r>
+        <w:lastRenderedPageBreak/>
+        <w:drawing>
+          <wp:inline distT="0" distB="0" distL="0" distR="0" wp14:anchorId="0CBC5E48" wp14:editId="68585FC5">
+            <wp:extent cx="5943600" cy="2503805"/>
+            <wp:effectExtent l="0" t="0" r="0" b="0"/>
+            <wp:docPr id="35" name="Picture 35"/>
+            <wp:cNvGraphicFramePr>
+              <a:graphicFrameLocks xmlns:a="http://schemas.openxmlformats.org/drawingml/2006/main" noChangeAspect="1"/>
+            </wp:cNvGraphicFramePr>
+            <a:graphic xmlns:a="http://schemas.openxmlformats.org/drawingml/2006/main">
+              <a:graphicData uri="http://schemas.openxmlformats.org/drawingml/2006/picture">
+                <pic:pic xmlns:pic="http://schemas.openxmlformats.org/drawingml/2006/picture">
+                  <pic:nvPicPr>
+                    <pic:cNvPr id="1" name=""/>
+                    <pic:cNvPicPr/>
+                  </pic:nvPicPr>
+                  <pic:blipFill>
+                    <a:blip r:embed="rId35"/>
+                    <a:stretch>
+                      <a:fillRect/>
+                    </a:stretch>
+                  </pic:blipFill>
+                  <pic:spPr>
+                    <a:xfrm>
+                      <a:off x="0" y="0"/>
+                      <a:ext cx="5943600" cy="2503805"/>
+                    </a:xfrm>
+                    <a:prstGeom prst="rect">
+                      <a:avLst/>
+                    </a:prstGeom>
+                  </pic:spPr>
+                </pic:pic>
+              </a:graphicData>
+            </a:graphic>
+          </wp:inline>
+        </w:drawing>
+      </w:r>
+      <w:r>
+        <w:drawing>
+          <wp:inline distT="0" distB="0" distL="0" distR="0" wp14:anchorId="4D350ADD" wp14:editId="7F26A413">
+            <wp:extent cx="5943600" cy="1168400"/>
+            <wp:effectExtent l="0" t="0" r="0" b="0"/>
+            <wp:docPr id="34" name="Picture 34"/>
+            <wp:cNvGraphicFramePr>
+              <a:graphicFrameLocks xmlns:a="http://schemas.openxmlformats.org/drawingml/2006/main" noChangeAspect="1"/>
+            </wp:cNvGraphicFramePr>
+            <a:graphic xmlns:a="http://schemas.openxmlformats.org/drawingml/2006/main">
+              <a:graphicData uri="http://schemas.openxmlformats.org/drawingml/2006/picture">
+                <pic:pic xmlns:pic="http://schemas.openxmlformats.org/drawingml/2006/picture">
+                  <pic:nvPicPr>
+                    <pic:cNvPr id="1" name=""/>
+                    <pic:cNvPicPr/>
+                  </pic:nvPicPr>
+                  <pic:blipFill>
+                    <a:blip r:embed="rId36"/>
+                    <a:stretch>
+                      <a:fillRect/>
+                    </a:stretch>
+                  </pic:blipFill>
+                  <pic:spPr>
+                    <a:xfrm>
+                      <a:off x="0" y="0"/>
+                      <a:ext cx="5943600" cy="1168400"/>
+                    </a:xfrm>
+                    <a:prstGeom prst="rect">
+                      <a:avLst/>
+                    </a:prstGeom>
+                  </pic:spPr>
+                </pic:pic>
+              </a:graphicData>
+            </a:graphic>
+          </wp:inline>
+        </w:drawing>
+      </w:r>
+      <w:r>
+        <w:drawing>
+          <wp:inline distT="0" distB="0" distL="0" distR="0" wp14:anchorId="42BDBB25" wp14:editId="6AAA43CA">
+            <wp:extent cx="5943600" cy="1447165"/>
+            <wp:effectExtent l="0" t="0" r="0" b="635"/>
+            <wp:docPr id="36" name="Picture 36"/>
+            <wp:cNvGraphicFramePr>
+              <a:graphicFrameLocks xmlns:a="http://schemas.openxmlformats.org/drawingml/2006/main" noChangeAspect="1"/>
+            </wp:cNvGraphicFramePr>
+            <a:graphic xmlns:a="http://schemas.openxmlformats.org/drawingml/2006/main">
+              <a:graphicData uri="http://schemas.openxmlformats.org/drawingml/2006/picture">
+                <pic:pic xmlns:pic="http://schemas.openxmlformats.org/drawingml/2006/picture">
+                  <pic:nvPicPr>
+                    <pic:cNvPr id="1" name=""/>
+                    <pic:cNvPicPr/>
+                  </pic:nvPicPr>
+                  <pic:blipFill>
+                    <a:blip r:embed="rId37"/>
+                    <a:stretch>
+                      <a:fillRect/>
+                    </a:stretch>
+                  </pic:blipFill>
+                  <pic:spPr>
+                    <a:xfrm>
+                      <a:off x="0" y="0"/>
+                      <a:ext cx="5943600" cy="1447165"/>
+                    </a:xfrm>
+                    <a:prstGeom prst="rect">
+                      <a:avLst/>
+                    </a:prstGeom>
+                  </pic:spPr>
+                </pic:pic>
+              </a:graphicData>
+            </a:graphic>
+          </wp:inline>
+        </w:drawing>
+      </w:r>
+      <w:r>
+        <w:drawing>
+          <wp:inline distT="0" distB="0" distL="0" distR="0" wp14:anchorId="58774F36" wp14:editId="19C165CC">
+            <wp:extent cx="5943600" cy="2654300"/>
+            <wp:effectExtent l="0" t="0" r="0" b="0"/>
+            <wp:docPr id="37" name="Picture 37"/>
+            <wp:cNvGraphicFramePr>
+              <a:graphicFrameLocks xmlns:a="http://schemas.openxmlformats.org/drawingml/2006/main" noChangeAspect="1"/>
+            </wp:cNvGraphicFramePr>
+            <a:graphic xmlns:a="http://schemas.openxmlformats.org/drawingml/2006/main">
+              <a:graphicData uri="http://schemas.openxmlformats.org/drawingml/2006/picture">
+                <pic:pic xmlns:pic="http://schemas.openxmlformats.org/drawingml/2006/picture">
+                  <pic:nvPicPr>
+                    <pic:cNvPr id="1" name=""/>
+                    <pic:cNvPicPr/>
+                  </pic:nvPicPr>
+                  <pic:blipFill>
+                    <a:blip r:embed="rId38"/>
+                    <a:stretch>
+                      <a:fillRect/>
+                    </a:stretch>
+                  </pic:blipFill>
+                  <pic:spPr>
+                    <a:xfrm>
+                      <a:off x="0" y="0"/>
+                      <a:ext cx="5943600" cy="2654300"/>
+                    </a:xfrm>
+                    <a:prstGeom prst="rect">
+                      <a:avLst/>
+                    </a:prstGeom>
+                  </pic:spPr>
+                </pic:pic>
+              </a:graphicData>
+            </a:graphic>
+          </wp:inline>
+        </w:drawing>
+      </w:r>
+      <w:r>
+        <w:lastRenderedPageBreak/>
+        <w:drawing>
+          <wp:inline distT="0" distB="0" distL="0" distR="0" wp14:anchorId="0B2EF841" wp14:editId="1DEACF3F">
+            <wp:extent cx="5943600" cy="2096770"/>
+            <wp:effectExtent l="0" t="0" r="0" b="0"/>
+            <wp:docPr id="38" name="Picture 38"/>
+            <wp:cNvGraphicFramePr>
+              <a:graphicFrameLocks xmlns:a="http://schemas.openxmlformats.org/drawingml/2006/main" noChangeAspect="1"/>
+            </wp:cNvGraphicFramePr>
+            <a:graphic xmlns:a="http://schemas.openxmlformats.org/drawingml/2006/main">
+              <a:graphicData uri="http://schemas.openxmlformats.org/drawingml/2006/picture">
+                <pic:pic xmlns:pic="http://schemas.openxmlformats.org/drawingml/2006/picture">
+                  <pic:nvPicPr>
+                    <pic:cNvPr id="1" name=""/>
+                    <pic:cNvPicPr/>
+                  </pic:nvPicPr>
+                  <pic:blipFill>
+                    <a:blip r:embed="rId39"/>
+                    <a:stretch>
+                      <a:fillRect/>
+                    </a:stretch>
+                  </pic:blipFill>
+                  <pic:spPr>
+                    <a:xfrm>
+                      <a:off x="0" y="0"/>
+                      <a:ext cx="5943600" cy="2096770"/>
+                    </a:xfrm>
+                    <a:prstGeom prst="rect">
+                      <a:avLst/>
+                    </a:prstGeom>
+                  </pic:spPr>
+                </pic:pic>
+              </a:graphicData>
+            </a:graphic>
+          </wp:inline>
+        </w:drawing>
+      </w:r>
+      <w:r>
+        <w:drawing>
+          <wp:inline distT="0" distB="0" distL="0" distR="0" wp14:anchorId="082C18E7" wp14:editId="2C6ED371">
+            <wp:extent cx="5943600" cy="2432685"/>
+            <wp:effectExtent l="0" t="0" r="0" b="5715"/>
+            <wp:docPr id="39" name="Picture 39"/>
+            <wp:cNvGraphicFramePr>
+              <a:graphicFrameLocks xmlns:a="http://schemas.openxmlformats.org/drawingml/2006/main" noChangeAspect="1"/>
+            </wp:cNvGraphicFramePr>
+            <a:graphic xmlns:a="http://schemas.openxmlformats.org/drawingml/2006/main">
+              <a:graphicData uri="http://schemas.openxmlformats.org/drawingml/2006/picture">
+                <pic:pic xmlns:pic="http://schemas.openxmlformats.org/drawingml/2006/picture">
+                  <pic:nvPicPr>
+                    <pic:cNvPr id="1" name=""/>
+                    <pic:cNvPicPr/>
+                  </pic:nvPicPr>
+                  <pic:blipFill>
+                    <a:blip r:embed="rId40"/>
+                    <a:stretch>
+                      <a:fillRect/>
+                    </a:stretch>
+                  </pic:blipFill>
+                  <pic:spPr>
+                    <a:xfrm>
+                      <a:off x="0" y="0"/>
+                      <a:ext cx="5943600" cy="2432685"/>
+                    </a:xfrm>
+                    <a:prstGeom prst="rect">
+                      <a:avLst/>
+                    </a:prstGeom>
+                  </pic:spPr>
+                </pic:pic>
+              </a:graphicData>
+            </a:graphic>
+          </wp:inline>
+        </w:drawing>
+      </w:r>
+      <w:r>
+        <w:drawing>
+          <wp:inline distT="0" distB="0" distL="0" distR="0" wp14:anchorId="38AB31C7" wp14:editId="67B87090">
+            <wp:extent cx="5943600" cy="1925320"/>
+            <wp:effectExtent l="0" t="0" r="0" b="0"/>
+            <wp:docPr id="40" name="Picture 40"/>
+            <wp:cNvGraphicFramePr>
+              <a:graphicFrameLocks xmlns:a="http://schemas.openxmlformats.org/drawingml/2006/main" noChangeAspect="1"/>
+            </wp:cNvGraphicFramePr>
+            <a:graphic xmlns:a="http://schemas.openxmlformats.org/drawingml/2006/main">
+              <a:graphicData uri="http://schemas.openxmlformats.org/drawingml/2006/picture">
+                <pic:pic xmlns:pic="http://schemas.openxmlformats.org/drawingml/2006/picture">
+                  <pic:nvPicPr>
+                    <pic:cNvPr id="1" name=""/>
+                    <pic:cNvPicPr/>
+                  </pic:nvPicPr>
+                  <pic:blipFill>
+                    <a:blip r:embed="rId41"/>
+                    <a:stretch>
+                      <a:fillRect/>
+                    </a:stretch>
+                  </pic:blipFill>
+                  <pic:spPr>
+                    <a:xfrm>
+                      <a:off x="0" y="0"/>
+                      <a:ext cx="5943600" cy="1925320"/>
+                    </a:xfrm>
+                    <a:prstGeom prst="rect">
+                      <a:avLst/>
+                    </a:prstGeom>
+                  </pic:spPr>
+                </pic:pic>
+              </a:graphicData>
+            </a:graphic>
+          </wp:inline>
+        </w:drawing>
+      </w:r>
+      <w:r>
+        <w:lastRenderedPageBreak/>
+        <w:drawing>
+          <wp:inline distT="0" distB="0" distL="0" distR="0" wp14:anchorId="1254AE4A" wp14:editId="61AE4528">
+            <wp:extent cx="5943600" cy="2409825"/>
+            <wp:effectExtent l="0" t="0" r="0" b="9525"/>
+            <wp:docPr id="41" name="Picture 41"/>
+            <wp:cNvGraphicFramePr>
+              <a:graphicFrameLocks xmlns:a="http://schemas.openxmlformats.org/drawingml/2006/main" noChangeAspect="1"/>
+            </wp:cNvGraphicFramePr>
+            <a:graphic xmlns:a="http://schemas.openxmlformats.org/drawingml/2006/main">
+              <a:graphicData uri="http://schemas.openxmlformats.org/drawingml/2006/picture">
+                <pic:pic xmlns:pic="http://schemas.openxmlformats.org/drawingml/2006/picture">
+                  <pic:nvPicPr>
+                    <pic:cNvPr id="1" name=""/>
+                    <pic:cNvPicPr/>
+                  </pic:nvPicPr>
+                  <pic:blipFill>
+                    <a:blip r:embed="rId42"/>
+                    <a:stretch>
+                      <a:fillRect/>
+                    </a:stretch>
+                  </pic:blipFill>
+                  <pic:spPr>
+                    <a:xfrm>
+                      <a:off x="0" y="0"/>
+                      <a:ext cx="5943600" cy="2409825"/>
+                    </a:xfrm>
+                    <a:prstGeom prst="rect">
+                      <a:avLst/>
+                    </a:prstGeom>
+                  </pic:spPr>
+                </pic:pic>
+              </a:graphicData>
+            </a:graphic>
+          </wp:inline>
+        </w:drawing>
+      </w:r>
+      <w:r>
+        <w:drawing>
+          <wp:inline distT="0" distB="0" distL="0" distR="0" wp14:anchorId="05877518" wp14:editId="7EF3E791">
+            <wp:extent cx="5943600" cy="3105785"/>
+            <wp:effectExtent l="0" t="0" r="0" b="0"/>
+            <wp:docPr id="42" name="Picture 42"/>
+            <wp:cNvGraphicFramePr>
+              <a:graphicFrameLocks xmlns:a="http://schemas.openxmlformats.org/drawingml/2006/main" noChangeAspect="1"/>
+            </wp:cNvGraphicFramePr>
+            <a:graphic xmlns:a="http://schemas.openxmlformats.org/drawingml/2006/main">
+              <a:graphicData uri="http://schemas.openxmlformats.org/drawingml/2006/picture">
+                <pic:pic xmlns:pic="http://schemas.openxmlformats.org/drawingml/2006/picture">
+                  <pic:nvPicPr>
+                    <pic:cNvPr id="1" name=""/>
+                    <pic:cNvPicPr/>
+                  </pic:nvPicPr>
+                  <pic:blipFill>
+                    <a:blip r:embed="rId43"/>
+                    <a:stretch>
+                      <a:fillRect/>
+                    </a:stretch>
+                  </pic:blipFill>
+                  <pic:spPr>
+                    <a:xfrm>
+                      <a:off x="0" y="0"/>
+                      <a:ext cx="5943600" cy="3105785"/>
+                    </a:xfrm>
+                    <a:prstGeom prst="rect">
+                      <a:avLst/>
+                    </a:prstGeom>
+                  </pic:spPr>
+                </pic:pic>
+              </a:graphicData>
+            </a:graphic>
+          </wp:inline>
+        </w:drawing>
+      </w:r>
+      <w:r>
+        <w:drawing>
+          <wp:inline distT="0" distB="0" distL="0" distR="0" wp14:anchorId="4CF6B85B" wp14:editId="733E2459">
+            <wp:extent cx="5943600" cy="2524125"/>
+            <wp:effectExtent l="0" t="0" r="0" b="9525"/>
+            <wp:docPr id="43" name="Picture 43"/>
+            <wp:cNvGraphicFramePr>
+              <a:graphicFrameLocks xmlns:a="http://schemas.openxmlformats.org/drawingml/2006/main" noChangeAspect="1"/>
+            </wp:cNvGraphicFramePr>
+            <a:graphic xmlns:a="http://schemas.openxmlformats.org/drawingml/2006/main">
+              <a:graphicData uri="http://schemas.openxmlformats.org/drawingml/2006/picture">
+                <pic:pic xmlns:pic="http://schemas.openxmlformats.org/drawingml/2006/picture">
+                  <pic:nvPicPr>
+                    <pic:cNvPr id="1" name=""/>
+                    <pic:cNvPicPr/>
+                  </pic:nvPicPr>
+                  <pic:blipFill>
+                    <a:blip r:embed="rId44"/>
+                    <a:stretch>
+                      <a:fillRect/>
+                    </a:stretch>
+                  </pic:blipFill>
+                  <pic:spPr>
+                    <a:xfrm>
+                      <a:off x="0" y="0"/>
+                      <a:ext cx="5943600" cy="2524125"/>
+                    </a:xfrm>
+                    <a:prstGeom prst="rect">
+                      <a:avLst/>
+                    </a:prstGeom>
+                  </pic:spPr>
+                </pic:pic>
+              </a:graphicData>
+            </a:graphic>
+          </wp:inline>
+        </w:drawing>
+      </w:r>
+      <w:r>
+        <w:lastRenderedPageBreak/>
+        <w:drawing>
+          <wp:inline distT="0" distB="0" distL="0" distR="0" wp14:anchorId="771A0C70" wp14:editId="58D29133">
+            <wp:extent cx="5943600" cy="2998470"/>
+            <wp:effectExtent l="0" t="0" r="0" b="0"/>
+            <wp:docPr id="44" name="Picture 44"/>
+            <wp:cNvGraphicFramePr>
+              <a:graphicFrameLocks xmlns:a="http://schemas.openxmlformats.org/drawingml/2006/main" noChangeAspect="1"/>
+            </wp:cNvGraphicFramePr>
+            <a:graphic xmlns:a="http://schemas.openxmlformats.org/drawingml/2006/main">
+              <a:graphicData uri="http://schemas.openxmlformats.org/drawingml/2006/picture">
+                <pic:pic xmlns:pic="http://schemas.openxmlformats.org/drawingml/2006/picture">
+                  <pic:nvPicPr>
+                    <pic:cNvPr id="1" name=""/>
+                    <pic:cNvPicPr/>
+                  </pic:nvPicPr>
+                  <pic:blipFill>
+                    <a:blip r:embed="rId45"/>
+                    <a:stretch>
+                      <a:fillRect/>
+                    </a:stretch>
+                  </pic:blipFill>
+                  <pic:spPr>
+                    <a:xfrm>
+                      <a:off x="0" y="0"/>
+                      <a:ext cx="5943600" cy="2998470"/>
+                    </a:xfrm>
+                    <a:prstGeom prst="rect">
+                      <a:avLst/>
+                    </a:prstGeom>
+                  </pic:spPr>
+                </pic:pic>
+              </a:graphicData>
+            </a:graphic>
+          </wp:inline>
+        </w:drawing>
+      </w:r>
+      <w:r>
+        <w:drawing>
+          <wp:inline distT="0" distB="0" distL="0" distR="0" wp14:anchorId="41D8AB6D" wp14:editId="5C13FC7D">
+            <wp:extent cx="5943600" cy="2567305"/>
+            <wp:effectExtent l="0" t="0" r="0" b="4445"/>
+            <wp:docPr id="45" name="Picture 45"/>
+            <wp:cNvGraphicFramePr>
+              <a:graphicFrameLocks xmlns:a="http://schemas.openxmlformats.org/drawingml/2006/main" noChangeAspect="1"/>
+            </wp:cNvGraphicFramePr>
+            <a:graphic xmlns:a="http://schemas.openxmlformats.org/drawingml/2006/main">
+              <a:graphicData uri="http://schemas.openxmlformats.org/drawingml/2006/picture">
+                <pic:pic xmlns:pic="http://schemas.openxmlformats.org/drawingml/2006/picture">
+                  <pic:nvPicPr>
+                    <pic:cNvPr id="1" name=""/>
+                    <pic:cNvPicPr/>
+                  </pic:nvPicPr>
+                  <pic:blipFill>
+                    <a:blip r:embed="rId46"/>
+                    <a:stretch>
+                      <a:fillRect/>
+                    </a:stretch>
+                  </pic:blipFill>
+                  <pic:spPr>
+                    <a:xfrm>
+                      <a:off x="0" y="0"/>
+                      <a:ext cx="5943600" cy="2567305"/>
+                    </a:xfrm>
+                    <a:prstGeom prst="rect">
+                      <a:avLst/>
+                    </a:prstGeom>
+                  </pic:spPr>
+                </pic:pic>
+              </a:graphicData>
+            </a:graphic>
+          </wp:inline>
+        </w:drawing>
+      </w:r>
+      <w:r>
+        <w:drawing>
+          <wp:inline distT="0" distB="0" distL="0" distR="0" wp14:anchorId="469CA25D" wp14:editId="376F2123">
+            <wp:extent cx="5943600" cy="2094865"/>
+            <wp:effectExtent l="0" t="0" r="0" b="635"/>
+            <wp:docPr id="46" name="Picture 46"/>
+            <wp:cNvGraphicFramePr>
+              <a:graphicFrameLocks xmlns:a="http://schemas.openxmlformats.org/drawingml/2006/main" noChangeAspect="1"/>
+            </wp:cNvGraphicFramePr>
+            <a:graphic xmlns:a="http://schemas.openxmlformats.org/drawingml/2006/main">
+              <a:graphicData uri="http://schemas.openxmlformats.org/drawingml/2006/picture">
+                <pic:pic xmlns:pic="http://schemas.openxmlformats.org/drawingml/2006/picture">
+                  <pic:nvPicPr>
+                    <pic:cNvPr id="1" name=""/>
+                    <pic:cNvPicPr/>
+                  </pic:nvPicPr>
+                  <pic:blipFill>
+                    <a:blip r:embed="rId47"/>
+                    <a:stretch>
+                      <a:fillRect/>
+                    </a:stretch>
+                  </pic:blipFill>
+                  <pic:spPr>
+                    <a:xfrm>
+                      <a:off x="0" y="0"/>
+                      <a:ext cx="5943600" cy="2094865"/>
+                    </a:xfrm>
+                    <a:prstGeom prst="rect">
+                      <a:avLst/>
+                    </a:prstGeom>
+                  </pic:spPr>
+                </pic:pic>
+              </a:graphicData>
+            </a:graphic>
+          </wp:inline>
+        </w:drawing>
+      </w:r>
+      <w:r>
+        <w:lastRenderedPageBreak/>
+        <w:drawing>
+          <wp:inline distT="0" distB="0" distL="0" distR="0" wp14:anchorId="305A67AA" wp14:editId="42E07871">
+            <wp:extent cx="5943600" cy="1917700"/>
+            <wp:effectExtent l="0" t="0" r="0" b="6350"/>
+            <wp:docPr id="47" name="Picture 47"/>
+            <wp:cNvGraphicFramePr>
+              <a:graphicFrameLocks xmlns:a="http://schemas.openxmlformats.org/drawingml/2006/main" noChangeAspect="1"/>
+            </wp:cNvGraphicFramePr>
+            <a:graphic xmlns:a="http://schemas.openxmlformats.org/drawingml/2006/main">
+              <a:graphicData uri="http://schemas.openxmlformats.org/drawingml/2006/picture">
+                <pic:pic xmlns:pic="http://schemas.openxmlformats.org/drawingml/2006/picture">
+                  <pic:nvPicPr>
+                    <pic:cNvPr id="1" name=""/>
+                    <pic:cNvPicPr/>
+                  </pic:nvPicPr>
+                  <pic:blipFill>
+                    <a:blip r:embed="rId48"/>
+                    <a:stretch>
+                      <a:fillRect/>
+                    </a:stretch>
+                  </pic:blipFill>
+                  <pic:spPr>
+                    <a:xfrm>
+                      <a:off x="0" y="0"/>
+                      <a:ext cx="5943600" cy="1917700"/>
+                    </a:xfrm>
+                    <a:prstGeom prst="rect">
+                      <a:avLst/>
+                    </a:prstGeom>
+                  </pic:spPr>
+                </pic:pic>
+              </a:graphicData>
+            </a:graphic>
+          </wp:inline>
+        </w:drawing>
+      </w:r>
+      <w:r>
+        <w:drawing>
+          <wp:inline distT="0" distB="0" distL="0" distR="0" wp14:anchorId="528BE077" wp14:editId="3E80376F">
+            <wp:extent cx="5943600" cy="3843020"/>
+            <wp:effectExtent l="0" t="0" r="0" b="5080"/>
+            <wp:docPr id="48" name="Picture 48"/>
+            <wp:cNvGraphicFramePr>
+              <a:graphicFrameLocks xmlns:a="http://schemas.openxmlformats.org/drawingml/2006/main" noChangeAspect="1"/>
+            </wp:cNvGraphicFramePr>
+            <a:graphic xmlns:a="http://schemas.openxmlformats.org/drawingml/2006/main">
+              <a:graphicData uri="http://schemas.openxmlformats.org/drawingml/2006/picture">
+                <pic:pic xmlns:pic="http://schemas.openxmlformats.org/drawingml/2006/picture">
+                  <pic:nvPicPr>
+                    <pic:cNvPr id="1" name=""/>
+                    <pic:cNvPicPr/>
+                  </pic:nvPicPr>
+                  <pic:blipFill>
+                    <a:blip r:embed="rId49"/>
+                    <a:stretch>
+                      <a:fillRect/>
+                    </a:stretch>
+                  </pic:blipFill>
+                  <pic:spPr>
+                    <a:xfrm>
+                      <a:off x="0" y="0"/>
+                      <a:ext cx="5943600" cy="3843020"/>
                     </a:xfrm>
                     <a:prstGeom prst="rect">
                       <a:avLst/>

</xml_diff>

<commit_message>
Tao trang them moi lien he
</commit_message>
<xml_diff>
--- a/hình3.docx
+++ b/hình3.docx
@@ -489,6 +489,9 @@
         </w:drawing>
       </w:r>
       <w:r>
+        <w:rPr>
+          <w:noProof/>
+        </w:rPr>
         <w:lastRenderedPageBreak/>
         <w:drawing>
           <wp:inline distT="0" distB="0" distL="0" distR="0" wp14:anchorId="03A0D68C" wp14:editId="3A317779">
@@ -527,6 +530,9 @@
         </w:drawing>
       </w:r>
       <w:r>
+        <w:rPr>
+          <w:noProof/>
+        </w:rPr>
         <w:drawing>
           <wp:inline distT="0" distB="0" distL="0" distR="0" wp14:anchorId="01CC6176" wp14:editId="06F4B6B9">
             <wp:extent cx="5943600" cy="3027680"/>
@@ -564,6 +570,9 @@
         </w:drawing>
       </w:r>
       <w:r>
+        <w:rPr>
+          <w:noProof/>
+        </w:rPr>
         <w:lastRenderedPageBreak/>
         <w:drawing>
           <wp:inline distT="0" distB="0" distL="0" distR="0" wp14:anchorId="127D1B6C" wp14:editId="0C48925F">
@@ -602,6 +611,9 @@
         </w:drawing>
       </w:r>
       <w:r>
+        <w:rPr>
+          <w:noProof/>
+        </w:rPr>
         <w:drawing>
           <wp:inline distT="0" distB="0" distL="0" distR="0" wp14:anchorId="271571C2" wp14:editId="70FA945B">
             <wp:extent cx="5943600" cy="1727835"/>
@@ -639,6 +651,9 @@
         </w:drawing>
       </w:r>
       <w:r>
+        <w:rPr>
+          <w:noProof/>
+        </w:rPr>
         <w:drawing>
           <wp:inline distT="0" distB="0" distL="0" distR="0" wp14:anchorId="0D0B10EF" wp14:editId="2E048B48">
             <wp:extent cx="5943600" cy="1591945"/>
@@ -676,6 +691,9 @@
         </w:drawing>
       </w:r>
       <w:r>
+        <w:rPr>
+          <w:noProof/>
+        </w:rPr>
         <w:drawing>
           <wp:inline distT="0" distB="0" distL="0" distR="0" wp14:anchorId="583AC04F" wp14:editId="7B55D90A">
             <wp:extent cx="5943600" cy="2216785"/>
@@ -713,6 +731,9 @@
         </w:drawing>
       </w:r>
       <w:r>
+        <w:rPr>
+          <w:noProof/>
+        </w:rPr>
         <w:lastRenderedPageBreak/>
         <w:drawing>
           <wp:inline distT="0" distB="0" distL="0" distR="0" wp14:anchorId="3E0263C2" wp14:editId="7A42C0E6">
@@ -751,6 +772,9 @@
         </w:drawing>
       </w:r>
       <w:r>
+        <w:rPr>
+          <w:noProof/>
+        </w:rPr>
         <w:drawing>
           <wp:inline distT="0" distB="0" distL="0" distR="0" wp14:anchorId="69B1CFAE" wp14:editId="10B6E3FA">
             <wp:extent cx="5943600" cy="4597400"/>
@@ -788,6 +812,9 @@
         </w:drawing>
       </w:r>
       <w:r>
+        <w:rPr>
+          <w:noProof/>
+        </w:rPr>
         <w:lastRenderedPageBreak/>
         <w:drawing>
           <wp:inline distT="0" distB="0" distL="0" distR="0" wp14:anchorId="08BBDE4F" wp14:editId="1C327E95">
@@ -826,6 +853,9 @@
         </w:drawing>
       </w:r>
       <w:r>
+        <w:rPr>
+          <w:noProof/>
+        </w:rPr>
         <w:drawing>
           <wp:inline distT="0" distB="0" distL="0" distR="0" wp14:anchorId="14CAB336" wp14:editId="28B8C787">
             <wp:extent cx="5943600" cy="2995930"/>
@@ -863,6 +893,9 @@
         </w:drawing>
       </w:r>
       <w:r>
+        <w:rPr>
+          <w:noProof/>
+        </w:rPr>
         <w:lastRenderedPageBreak/>
         <w:drawing>
           <wp:inline distT="0" distB="0" distL="0" distR="0" wp14:anchorId="20CC951E" wp14:editId="3DBBDFCB">
@@ -901,6 +934,9 @@
         </w:drawing>
       </w:r>
       <w:r>
+        <w:rPr>
+          <w:noProof/>
+        </w:rPr>
         <w:drawing>
           <wp:inline distT="0" distB="0" distL="0" distR="0" wp14:anchorId="2E456CA6" wp14:editId="2F54FB27">
             <wp:extent cx="5943600" cy="3985895"/>
@@ -938,6 +974,9 @@
         </w:drawing>
       </w:r>
       <w:r>
+        <w:rPr>
+          <w:noProof/>
+        </w:rPr>
         <w:lastRenderedPageBreak/>
         <w:drawing>
           <wp:inline distT="0" distB="0" distL="0" distR="0" wp14:anchorId="4EF3FFC6" wp14:editId="24611B65">
@@ -976,6 +1015,9 @@
         </w:drawing>
       </w:r>
       <w:r>
+        <w:rPr>
+          <w:noProof/>
+        </w:rPr>
         <w:drawing>
           <wp:inline distT="0" distB="0" distL="0" distR="0" wp14:anchorId="23C644B4" wp14:editId="4BF290C4">
             <wp:extent cx="5943600" cy="3494405"/>
@@ -1013,6 +1055,9 @@
         </w:drawing>
       </w:r>
       <w:r>
+        <w:rPr>
+          <w:noProof/>
+        </w:rPr>
         <w:lastRenderedPageBreak/>
         <w:drawing>
           <wp:inline distT="0" distB="0" distL="0" distR="0" wp14:anchorId="6961C7FD" wp14:editId="3DCCFEF9">
@@ -1051,6 +1096,9 @@
         </w:drawing>
       </w:r>
       <w:r>
+        <w:rPr>
+          <w:noProof/>
+        </w:rPr>
         <w:drawing>
           <wp:inline distT="0" distB="0" distL="0" distR="0" wp14:anchorId="356E674E" wp14:editId="6B6C1D41">
             <wp:extent cx="5943600" cy="2274570"/>
@@ -1088,6 +1136,9 @@
         </w:drawing>
       </w:r>
       <w:r>
+        <w:rPr>
+          <w:noProof/>
+        </w:rPr>
         <w:drawing>
           <wp:inline distT="0" distB="0" distL="0" distR="0" wp14:anchorId="2056DFC7" wp14:editId="3122C435">
             <wp:extent cx="5943600" cy="2063750"/>
@@ -1125,6 +1176,9 @@
         </w:drawing>
       </w:r>
       <w:r>
+        <w:rPr>
+          <w:noProof/>
+        </w:rPr>
         <w:lastRenderedPageBreak/>
         <w:drawing>
           <wp:inline distT="0" distB="0" distL="0" distR="0" wp14:anchorId="5C507584" wp14:editId="0009177D">
@@ -1163,6 +1217,9 @@
         </w:drawing>
       </w:r>
       <w:r>
+        <w:rPr>
+          <w:noProof/>
+        </w:rPr>
         <w:drawing>
           <wp:inline distT="0" distB="0" distL="0" distR="0" wp14:anchorId="368CCCFB" wp14:editId="04A93664">
             <wp:extent cx="5943600" cy="3244215"/>
@@ -1200,6 +1257,9 @@
         </w:drawing>
       </w:r>
       <w:r>
+        <w:rPr>
+          <w:noProof/>
+        </w:rPr>
         <w:lastRenderedPageBreak/>
         <w:drawing>
           <wp:inline distT="0" distB="0" distL="0" distR="0" wp14:anchorId="0CBC5E48" wp14:editId="68585FC5">
@@ -1238,6 +1298,9 @@
         </w:drawing>
       </w:r>
       <w:r>
+        <w:rPr>
+          <w:noProof/>
+        </w:rPr>
         <w:drawing>
           <wp:inline distT="0" distB="0" distL="0" distR="0" wp14:anchorId="4D350ADD" wp14:editId="7F26A413">
             <wp:extent cx="5943600" cy="1168400"/>
@@ -1275,6 +1338,9 @@
         </w:drawing>
       </w:r>
       <w:r>
+        <w:rPr>
+          <w:noProof/>
+        </w:rPr>
         <w:drawing>
           <wp:inline distT="0" distB="0" distL="0" distR="0" wp14:anchorId="42BDBB25" wp14:editId="6AAA43CA">
             <wp:extent cx="5943600" cy="1447165"/>
@@ -1312,6 +1378,9 @@
         </w:drawing>
       </w:r>
       <w:r>
+        <w:rPr>
+          <w:noProof/>
+        </w:rPr>
         <w:drawing>
           <wp:inline distT="0" distB="0" distL="0" distR="0" wp14:anchorId="58774F36" wp14:editId="19C165CC">
             <wp:extent cx="5943600" cy="2654300"/>
@@ -1349,6 +1418,9 @@
         </w:drawing>
       </w:r>
       <w:r>
+        <w:rPr>
+          <w:noProof/>
+        </w:rPr>
         <w:lastRenderedPageBreak/>
         <w:drawing>
           <wp:inline distT="0" distB="0" distL="0" distR="0" wp14:anchorId="0B2EF841" wp14:editId="1DEACF3F">
@@ -1387,6 +1459,9 @@
         </w:drawing>
       </w:r>
       <w:r>
+        <w:rPr>
+          <w:noProof/>
+        </w:rPr>
         <w:drawing>
           <wp:inline distT="0" distB="0" distL="0" distR="0" wp14:anchorId="082C18E7" wp14:editId="2C6ED371">
             <wp:extent cx="5943600" cy="2432685"/>
@@ -1424,6 +1499,9 @@
         </w:drawing>
       </w:r>
       <w:r>
+        <w:rPr>
+          <w:noProof/>
+        </w:rPr>
         <w:drawing>
           <wp:inline distT="0" distB="0" distL="0" distR="0" wp14:anchorId="38AB31C7" wp14:editId="67B87090">
             <wp:extent cx="5943600" cy="1925320"/>
@@ -1461,6 +1539,9 @@
         </w:drawing>
       </w:r>
       <w:r>
+        <w:rPr>
+          <w:noProof/>
+        </w:rPr>
         <w:lastRenderedPageBreak/>
         <w:drawing>
           <wp:inline distT="0" distB="0" distL="0" distR="0" wp14:anchorId="1254AE4A" wp14:editId="61AE4528">
@@ -1499,6 +1580,9 @@
         </w:drawing>
       </w:r>
       <w:r>
+        <w:rPr>
+          <w:noProof/>
+        </w:rPr>
         <w:drawing>
           <wp:inline distT="0" distB="0" distL="0" distR="0" wp14:anchorId="05877518" wp14:editId="7EF3E791">
             <wp:extent cx="5943600" cy="3105785"/>
@@ -1536,6 +1620,9 @@
         </w:drawing>
       </w:r>
       <w:r>
+        <w:rPr>
+          <w:noProof/>
+        </w:rPr>
         <w:drawing>
           <wp:inline distT="0" distB="0" distL="0" distR="0" wp14:anchorId="4CF6B85B" wp14:editId="733E2459">
             <wp:extent cx="5943600" cy="2524125"/>
@@ -1573,6 +1660,9 @@
         </w:drawing>
       </w:r>
       <w:r>
+        <w:rPr>
+          <w:noProof/>
+        </w:rPr>
         <w:lastRenderedPageBreak/>
         <w:drawing>
           <wp:inline distT="0" distB="0" distL="0" distR="0" wp14:anchorId="771A0C70" wp14:editId="58D29133">
@@ -1611,6 +1701,9 @@
         </w:drawing>
       </w:r>
       <w:r>
+        <w:rPr>
+          <w:noProof/>
+        </w:rPr>
         <w:drawing>
           <wp:inline distT="0" distB="0" distL="0" distR="0" wp14:anchorId="41D8AB6D" wp14:editId="5C13FC7D">
             <wp:extent cx="5943600" cy="2567305"/>
@@ -1648,6 +1741,9 @@
         </w:drawing>
       </w:r>
       <w:r>
+        <w:rPr>
+          <w:noProof/>
+        </w:rPr>
         <w:drawing>
           <wp:inline distT="0" distB="0" distL="0" distR="0" wp14:anchorId="469CA25D" wp14:editId="376F2123">
             <wp:extent cx="5943600" cy="2094865"/>
@@ -1685,6 +1781,9 @@
         </w:drawing>
       </w:r>
       <w:r>
+        <w:rPr>
+          <w:noProof/>
+        </w:rPr>
         <w:lastRenderedPageBreak/>
         <w:drawing>
           <wp:inline distT="0" distB="0" distL="0" distR="0" wp14:anchorId="305A67AA" wp14:editId="42E07871">
@@ -1723,6 +1822,9 @@
         </w:drawing>
       </w:r>
       <w:r>
+        <w:rPr>
+          <w:noProof/>
+        </w:rPr>
         <w:drawing>
           <wp:inline distT="0" distB="0" distL="0" distR="0" wp14:anchorId="528BE077" wp14:editId="3E80376F">
             <wp:extent cx="5943600" cy="3843020"/>
@@ -1748,6 +1850,288 @@
                     <a:xfrm>
                       <a:off x="0" y="0"/>
                       <a:ext cx="5943600" cy="3843020"/>
+                    </a:xfrm>
+                    <a:prstGeom prst="rect">
+                      <a:avLst/>
+                    </a:prstGeom>
+                  </pic:spPr>
+                </pic:pic>
+              </a:graphicData>
+            </a:graphic>
+          </wp:inline>
+        </w:drawing>
+      </w:r>
+      <w:r>
+        <w:rPr>
+          <w:noProof/>
+        </w:rPr>
+        <w:drawing>
+          <wp:inline distT="0" distB="0" distL="0" distR="0" wp14:anchorId="1FB619DE" wp14:editId="25CF5E72">
+            <wp:extent cx="5943600" cy="2254885"/>
+            <wp:effectExtent l="0" t="0" r="0" b="0"/>
+            <wp:docPr id="49" name="Picture 49"/>
+            <wp:cNvGraphicFramePr>
+              <a:graphicFrameLocks xmlns:a="http://schemas.openxmlformats.org/drawingml/2006/main" noChangeAspect="1"/>
+            </wp:cNvGraphicFramePr>
+            <a:graphic xmlns:a="http://schemas.openxmlformats.org/drawingml/2006/main">
+              <a:graphicData uri="http://schemas.openxmlformats.org/drawingml/2006/picture">
+                <pic:pic xmlns:pic="http://schemas.openxmlformats.org/drawingml/2006/picture">
+                  <pic:nvPicPr>
+                    <pic:cNvPr id="1" name=""/>
+                    <pic:cNvPicPr/>
+                  </pic:nvPicPr>
+                  <pic:blipFill>
+                    <a:blip r:embed="rId50"/>
+                    <a:stretch>
+                      <a:fillRect/>
+                    </a:stretch>
+                  </pic:blipFill>
+                  <pic:spPr>
+                    <a:xfrm>
+                      <a:off x="0" y="0"/>
+                      <a:ext cx="5943600" cy="2254885"/>
+                    </a:xfrm>
+                    <a:prstGeom prst="rect">
+                      <a:avLst/>
+                    </a:prstGeom>
+                  </pic:spPr>
+                </pic:pic>
+              </a:graphicData>
+            </a:graphic>
+          </wp:inline>
+        </w:drawing>
+      </w:r>
+      <w:r>
+        <w:rPr>
+          <w:noProof/>
+        </w:rPr>
+        <w:lastRenderedPageBreak/>
+        <w:drawing>
+          <wp:inline distT="0" distB="0" distL="0" distR="0" wp14:anchorId="64D17711" wp14:editId="2B2B6FC7">
+            <wp:extent cx="5943600" cy="2858770"/>
+            <wp:effectExtent l="0" t="0" r="0" b="0"/>
+            <wp:docPr id="50" name="Picture 50"/>
+            <wp:cNvGraphicFramePr>
+              <a:graphicFrameLocks xmlns:a="http://schemas.openxmlformats.org/drawingml/2006/main" noChangeAspect="1"/>
+            </wp:cNvGraphicFramePr>
+            <a:graphic xmlns:a="http://schemas.openxmlformats.org/drawingml/2006/main">
+              <a:graphicData uri="http://schemas.openxmlformats.org/drawingml/2006/picture">
+                <pic:pic xmlns:pic="http://schemas.openxmlformats.org/drawingml/2006/picture">
+                  <pic:nvPicPr>
+                    <pic:cNvPr id="1" name=""/>
+                    <pic:cNvPicPr/>
+                  </pic:nvPicPr>
+                  <pic:blipFill>
+                    <a:blip r:embed="rId51"/>
+                    <a:stretch>
+                      <a:fillRect/>
+                    </a:stretch>
+                  </pic:blipFill>
+                  <pic:spPr>
+                    <a:xfrm>
+                      <a:off x="0" y="0"/>
+                      <a:ext cx="5943600" cy="2858770"/>
+                    </a:xfrm>
+                    <a:prstGeom prst="rect">
+                      <a:avLst/>
+                    </a:prstGeom>
+                  </pic:spPr>
+                </pic:pic>
+              </a:graphicData>
+            </a:graphic>
+          </wp:inline>
+        </w:drawing>
+      </w:r>
+      <w:r>
+        <w:rPr>
+          <w:noProof/>
+        </w:rPr>
+        <w:drawing>
+          <wp:inline distT="0" distB="0" distL="0" distR="0" wp14:anchorId="6F73AF14" wp14:editId="55D15F26">
+            <wp:extent cx="5943600" cy="2369820"/>
+            <wp:effectExtent l="0" t="0" r="0" b="0"/>
+            <wp:docPr id="51" name="Picture 51"/>
+            <wp:cNvGraphicFramePr>
+              <a:graphicFrameLocks xmlns:a="http://schemas.openxmlformats.org/drawingml/2006/main" noChangeAspect="1"/>
+            </wp:cNvGraphicFramePr>
+            <a:graphic xmlns:a="http://schemas.openxmlformats.org/drawingml/2006/main">
+              <a:graphicData uri="http://schemas.openxmlformats.org/drawingml/2006/picture">
+                <pic:pic xmlns:pic="http://schemas.openxmlformats.org/drawingml/2006/picture">
+                  <pic:nvPicPr>
+                    <pic:cNvPr id="1" name=""/>
+                    <pic:cNvPicPr/>
+                  </pic:nvPicPr>
+                  <pic:blipFill>
+                    <a:blip r:embed="rId52"/>
+                    <a:stretch>
+                      <a:fillRect/>
+                    </a:stretch>
+                  </pic:blipFill>
+                  <pic:spPr>
+                    <a:xfrm>
+                      <a:off x="0" y="0"/>
+                      <a:ext cx="5943600" cy="2369820"/>
+                    </a:xfrm>
+                    <a:prstGeom prst="rect">
+                      <a:avLst/>
+                    </a:prstGeom>
+                  </pic:spPr>
+                </pic:pic>
+              </a:graphicData>
+            </a:graphic>
+          </wp:inline>
+        </w:drawing>
+      </w:r>
+      <w:r>
+        <w:lastRenderedPageBreak/>
+        <w:drawing>
+          <wp:inline distT="0" distB="0" distL="0" distR="0" wp14:anchorId="21837B04" wp14:editId="125D3C4D">
+            <wp:extent cx="5943600" cy="3510280"/>
+            <wp:effectExtent l="0" t="0" r="0" b="0"/>
+            <wp:docPr id="19" name="Picture 19"/>
+            <wp:cNvGraphicFramePr>
+              <a:graphicFrameLocks xmlns:a="http://schemas.openxmlformats.org/drawingml/2006/main" noChangeAspect="1"/>
+            </wp:cNvGraphicFramePr>
+            <a:graphic xmlns:a="http://schemas.openxmlformats.org/drawingml/2006/main">
+              <a:graphicData uri="http://schemas.openxmlformats.org/drawingml/2006/picture">
+                <pic:pic xmlns:pic="http://schemas.openxmlformats.org/drawingml/2006/picture">
+                  <pic:nvPicPr>
+                    <pic:cNvPr id="1" name=""/>
+                    <pic:cNvPicPr/>
+                  </pic:nvPicPr>
+                  <pic:blipFill>
+                    <a:blip r:embed="rId53"/>
+                    <a:stretch>
+                      <a:fillRect/>
+                    </a:stretch>
+                  </pic:blipFill>
+                  <pic:spPr>
+                    <a:xfrm>
+                      <a:off x="0" y="0"/>
+                      <a:ext cx="5943600" cy="3510280"/>
+                    </a:xfrm>
+                    <a:prstGeom prst="rect">
+                      <a:avLst/>
+                    </a:prstGeom>
+                  </pic:spPr>
+                </pic:pic>
+              </a:graphicData>
+            </a:graphic>
+          </wp:inline>
+        </w:drawing>
+      </w:r>
+      <w:r>
+        <w:rPr>
+          <w:noProof/>
+        </w:rPr>
+        <w:lastRenderedPageBreak/>
+        <w:drawing>
+          <wp:inline distT="0" distB="0" distL="0" distR="0" wp14:anchorId="296DB344" wp14:editId="179237B2">
+            <wp:extent cx="5943600" cy="5569585"/>
+            <wp:effectExtent l="0" t="0" r="0" b="0"/>
+            <wp:docPr id="52" name="Picture 52"/>
+            <wp:cNvGraphicFramePr>
+              <a:graphicFrameLocks xmlns:a="http://schemas.openxmlformats.org/drawingml/2006/main" noChangeAspect="1"/>
+            </wp:cNvGraphicFramePr>
+            <a:graphic xmlns:a="http://schemas.openxmlformats.org/drawingml/2006/main">
+              <a:graphicData uri="http://schemas.openxmlformats.org/drawingml/2006/picture">
+                <pic:pic xmlns:pic="http://schemas.openxmlformats.org/drawingml/2006/picture">
+                  <pic:nvPicPr>
+                    <pic:cNvPr id="1" name=""/>
+                    <pic:cNvPicPr/>
+                  </pic:nvPicPr>
+                  <pic:blipFill>
+                    <a:blip r:embed="rId54"/>
+                    <a:stretch>
+                      <a:fillRect/>
+                    </a:stretch>
+                  </pic:blipFill>
+                  <pic:spPr>
+                    <a:xfrm>
+                      <a:off x="0" y="0"/>
+                      <a:ext cx="5943600" cy="5569585"/>
+                    </a:xfrm>
+                    <a:prstGeom prst="rect">
+                      <a:avLst/>
+                    </a:prstGeom>
+                  </pic:spPr>
+                </pic:pic>
+              </a:graphicData>
+            </a:graphic>
+          </wp:inline>
+        </w:drawing>
+      </w:r>
+      <w:r>
+        <w:rPr>
+          <w:noProof/>
+        </w:rPr>
+        <w:lastRenderedPageBreak/>
+        <w:drawing>
+          <wp:inline distT="0" distB="0" distL="0" distR="0" wp14:anchorId="55878885" wp14:editId="6B4FB882">
+            <wp:extent cx="5943600" cy="5213350"/>
+            <wp:effectExtent l="0" t="0" r="0" b="6350"/>
+            <wp:docPr id="53" name="Picture 53"/>
+            <wp:cNvGraphicFramePr>
+              <a:graphicFrameLocks xmlns:a="http://schemas.openxmlformats.org/drawingml/2006/main" noChangeAspect="1"/>
+            </wp:cNvGraphicFramePr>
+            <a:graphic xmlns:a="http://schemas.openxmlformats.org/drawingml/2006/main">
+              <a:graphicData uri="http://schemas.openxmlformats.org/drawingml/2006/picture">
+                <pic:pic xmlns:pic="http://schemas.openxmlformats.org/drawingml/2006/picture">
+                  <pic:nvPicPr>
+                    <pic:cNvPr id="1" name=""/>
+                    <pic:cNvPicPr/>
+                  </pic:nvPicPr>
+                  <pic:blipFill>
+                    <a:blip r:embed="rId55"/>
+                    <a:stretch>
+                      <a:fillRect/>
+                    </a:stretch>
+                  </pic:blipFill>
+                  <pic:spPr>
+                    <a:xfrm>
+                      <a:off x="0" y="0"/>
+                      <a:ext cx="5943600" cy="5213350"/>
+                    </a:xfrm>
+                    <a:prstGeom prst="rect">
+                      <a:avLst/>
+                    </a:prstGeom>
+                  </pic:spPr>
+                </pic:pic>
+              </a:graphicData>
+            </a:graphic>
+          </wp:inline>
+        </w:drawing>
+      </w:r>
+      <w:r>
+        <w:rPr>
+          <w:noProof/>
+        </w:rPr>
+        <w:lastRenderedPageBreak/>
+        <w:drawing>
+          <wp:inline distT="0" distB="0" distL="0" distR="0" wp14:anchorId="4851C15F" wp14:editId="03742E2F">
+            <wp:extent cx="3433445" cy="8229600"/>
+            <wp:effectExtent l="0" t="0" r="0" b="0"/>
+            <wp:docPr id="55" name="Picture 55"/>
+            <wp:cNvGraphicFramePr>
+              <a:graphicFrameLocks xmlns:a="http://schemas.openxmlformats.org/drawingml/2006/main" noChangeAspect="1"/>
+            </wp:cNvGraphicFramePr>
+            <a:graphic xmlns:a="http://schemas.openxmlformats.org/drawingml/2006/main">
+              <a:graphicData uri="http://schemas.openxmlformats.org/drawingml/2006/picture">
+                <pic:pic xmlns:pic="http://schemas.openxmlformats.org/drawingml/2006/picture">
+                  <pic:nvPicPr>
+                    <pic:cNvPr id="1" name=""/>
+                    <pic:cNvPicPr/>
+                  </pic:nvPicPr>
+                  <pic:blipFill>
+                    <a:blip r:embed="rId56"/>
+                    <a:stretch>
+                      <a:fillRect/>
+                    </a:stretch>
+                  </pic:blipFill>
+                  <pic:spPr>
+                    <a:xfrm>
+                      <a:off x="0" y="0"/>
+                      <a:ext cx="3433445" cy="8229600"/>
                     </a:xfrm>
                     <a:prstGeom prst="rect">
                       <a:avLst/>

</xml_diff>